<commit_message>
Update article intro, title and best-description table
Co-Authored-By: Claude Opus 5.5 <noreply@anthropic.com>
Claude-Session: https://claude.ai/code/session_013eDWitjvTCKSNfBCSPqKhM
</commit_message>
<xml_diff>
--- a/article/AI_Product_Rankings_Article.docx
+++ b/article/AI_Product_Rankings_Article.docx
@@ -8,42 +8,28 @@
       </w:pPr>
       <w:r>
         <w:rPr/>
-        <w:t xml:space="preserve">What Makes AI Recommend Your Product? Lessons From 2,000 Shopping Tests</w:t>
+        <w:t xml:space="preserve">Does Rewriting Your Product Description Help It Rank in AI Search?</w:t>
       </w:r>
     </w:p>
     <w:p>
       <w:pPr/>
       <w:r>
         <w:rPr/>
-        <w:t xml:space="preserve">When we ask ChatGPT what to buy, it reads the listings it finds and decides which ones to recommend first. A team from MIT and Columbia set out to learn what makes an AI put one product above another.</w:t>
+        <w:t xml:space="preserve">When we ask an AI model like ChatGPT to find a product to buy, it reads the listings from different sources, including the product descriptions, and decides which ones to recommend first.</w:t>
       </w:r>
     </w:p>
     <w:p>
       <w:pPr/>
       <w:r>
         <w:rPr/>
-        <w:t xml:space="preserve">The study used 2,000 real shopping questions from Reddit, like “I need a toaster that lasts, any ideas?”. Each question came with 10 Amazon products.</w:t>
+        <w:t xml:space="preserve">A team from MIT and Columbia studied how much the product description affects which product the AI recommends first. The study used 2,000 real shopping questions from Reddit, like “I need a toaster that lasts, any ideas?”. Each question came with 10 Amazon products. An LLM read the question and ranked the 10 products from best to worst for that shopper. The test ran on five LLMs: ChatGPT (GPT-5), Claude, Gemini, DeepSeek and Llama.</w:t>
       </w:r>
     </w:p>
     <w:p>
       <w:pPr/>
       <w:r>
         <w:rPr/>
-        <w:t xml:space="preserve">An AI read the question and ranked the 10 products from best to worst for that shopper. The test ran on five AIs: ChatGPT (GPT-5), Claude, Gemini, DeepSeek and Llama.</w:t>
-      </w:r>
-    </w:p>
-    <w:p>
-      <w:pPr/>
-      <w:r>
-        <w:rPr/>
-        <w:t xml:space="preserve">Next, one product’s description was rewritten, and the AI ranked all 10 again to see whether the rewrite moved it up or down the list. In the tables below, a positive number means the product moved up by that many places on average, and a negative number means it moved down.</w:t>
-      </w:r>
-    </w:p>
-    <w:p>
-      <w:pPr/>
-      <w:r>
-        <w:rPr/>
-        <w:t xml:space="preserve">We’ll start with what worked.</w:t>
+        <w:t xml:space="preserve">Next, one product’s description was rewritten, and the AI ranked all 10 again to see whether the rewrite moved it up or down the list.</w:t>
       </w:r>
     </w:p>
     <w:p>
@@ -131,7 +117,7 @@
                 <w:b/>
                 <w:sz w:val="19"/>
               </w:rPr>
-              <w:t xml:space="preserve">Average places moved</w:t>
+              <w:t xml:space="preserve">Average rank moved</w:t>
             </w:r>
           </w:p>
         </w:tc>
@@ -397,7 +383,7 @@
       <w:pPr/>
       <w:r>
         <w:rPr/>
-        <w:t xml:space="preserve">The researchers kept testing and refining the rewriting instructions over many rounds. The instructions that improved rankings the most all asked for:</w:t>
+        <w:t xml:space="preserve">The prompt instructions that improved rankings the most all asked for:</w:t>
       </w:r>
     </w:p>
     <w:p>
@@ -531,7 +517,7 @@
                 <w:b/>
                 <w:sz w:val="19"/>
               </w:rPr>
-              <w:t xml:space="preserve">Best instructions</w:t>
+              <w:t xml:space="preserve">Descriptions rewritten using this checklist</w:t>
             </w:r>
           </w:p>
         </w:tc>
@@ -657,7 +643,7 @@
               <w:rPr>
                 <w:sz w:val="19"/>
               </w:rPr>
-              <w:t xml:space="preserve">Top instruction A</w:t>
+              <w:t xml:space="preserve">Rank moved</w:t>
             </w:r>
           </w:p>
         </w:tc>
@@ -754,120 +740,6 @@
                 <w:sz w:val="19"/>
               </w:rPr>
               <w:t xml:space="preserve">+0.29</w:t>
-            </w:r>
-          </w:p>
-        </w:tc>
-      </w:tr>
-      <w:tr>
-        <w:tc>
-          <w:tcPr>
-            <w:tcW w:w="2808" w:type="dxa"/>
-          </w:tcPr>
-          <w:p>
-            <w:pPr>
-              <w:spacing w:before="40" w:after="40"/>
-            </w:pPr>
-            <w:r>
-              <w:rPr>
-                <w:sz w:val="19"/>
-              </w:rPr>
-              <w:t xml:space="preserve">Top instruction B</w:t>
-            </w:r>
-          </w:p>
-        </w:tc>
-        <w:tc>
-          <w:tcPr>
-            <w:tcW w:w="1092" w:type="dxa"/>
-          </w:tcPr>
-          <w:p>
-            <w:pPr>
-              <w:spacing w:before="40" w:after="40"/>
-            </w:pPr>
-            <w:r>
-              <w:rPr>
-                <w:sz w:val="19"/>
-              </w:rPr>
-              <w:t xml:space="preserve">+0.11</w:t>
-            </w:r>
-          </w:p>
-        </w:tc>
-        <w:tc>
-          <w:tcPr>
-            <w:tcW w:w="1092" w:type="dxa"/>
-          </w:tcPr>
-          <w:p>
-            <w:pPr>
-              <w:spacing w:before="40" w:after="40"/>
-            </w:pPr>
-            <w:r>
-              <w:rPr>
-                <w:sz w:val="19"/>
-              </w:rPr>
-              <w:t xml:space="preserve">+0.40</w:t>
-            </w:r>
-          </w:p>
-        </w:tc>
-        <w:tc>
-          <w:tcPr>
-            <w:tcW w:w="1092" w:type="dxa"/>
-          </w:tcPr>
-          <w:p>
-            <w:pPr>
-              <w:spacing w:before="40" w:after="40"/>
-            </w:pPr>
-            <w:r>
-              <w:rPr>
-                <w:sz w:val="19"/>
-              </w:rPr>
-              <w:t xml:space="preserve">+0.04</w:t>
-            </w:r>
-          </w:p>
-        </w:tc>
-        <w:tc>
-          <w:tcPr>
-            <w:tcW w:w="1092" w:type="dxa"/>
-          </w:tcPr>
-          <w:p>
-            <w:pPr>
-              <w:spacing w:before="40" w:after="40"/>
-            </w:pPr>
-            <w:r>
-              <w:rPr>
-                <w:sz w:val="19"/>
-              </w:rPr>
-              <w:t xml:space="preserve">+0.24</w:t>
-            </w:r>
-          </w:p>
-        </w:tc>
-        <w:tc>
-          <w:tcPr>
-            <w:tcW w:w="1092" w:type="dxa"/>
-          </w:tcPr>
-          <w:p>
-            <w:pPr>
-              <w:spacing w:before="40" w:after="40"/>
-            </w:pPr>
-            <w:r>
-              <w:rPr>
-                <w:sz w:val="19"/>
-              </w:rPr>
-              <w:t xml:space="preserve">+0.53</w:t>
-            </w:r>
-          </w:p>
-        </w:tc>
-        <w:tc>
-          <w:tcPr>
-            <w:tcW w:w="1092" w:type="dxa"/>
-          </w:tcPr>
-          <w:p>
-            <w:pPr>
-              <w:spacing w:before="40" w:after="40"/>
-            </w:pPr>
-            <w:r>
-              <w:rPr>
-                <w:sz w:val="19"/>
-              </w:rPr>
-              <w:t xml:space="preserve">+0.26</w:t>
             </w:r>
           </w:p>
         </w:tc>
@@ -879,7 +751,7 @@
       </w:pPr>
       <w:r>
         <w:rPr/>
-        <w:t xml:space="preserve">Source: E-GEO, Table 6 (refined “unique” and “competitive” instructions) and Figure 3</w:t>
+        <w:t xml:space="preserve">Source: E-GEO, Table 6 (best-performing refined instruction) and Figure 3</w:t>
       </w:r>
     </w:p>
     <w:p>

</xml_diff>